<commit_message>
docs(entrega): agrega referencia de la Fuente et al. (2023) verificada
</commit_message>
<xml_diff>
--- a/reports/entrega/02_Bibliografia_CebadaVision.docx
+++ b/reports/entrega/02_Bibliografia_CebadaVision.docx
@@ -60,6 +60,37 @@
           <w:rFonts w:ascii="Calibri" w:cs="Calibri" w:eastAsia="Calibri" w:hAnsi="Calibri"/>
         </w:rPr>
         <w:t xml:space="preserve">, 45(1), 5–32.</w:t>
+      </w:r>
+    </w:p>
+    <w:p>
+      <w:pPr>
+        <w:pStyle w:val="ListParagraph"/>
+        <w:numPr>
+          <w:ilvl w:val="0"/>
+          <w:numId w:val="2"/>
+        </w:numPr>
+        <w:spacing w:after="80" w:line="276"/>
+        <w:jc w:val="both"/>
+      </w:pPr>
+      <w:r>
+        <w:rPr>
+          <w:rFonts w:ascii="Calibri" w:cs="Calibri" w:eastAsia="Calibri" w:hAnsi="Calibri"/>
+        </w:rPr>
+        <w:t xml:space="preserve">de la Fuente, D., et al. (2023). Yield estimation using machine learning from satellite imagery. </w:t>
+      </w:r>
+      <w:r>
+        <w:rPr>
+          <w:rFonts w:ascii="Calibri" w:cs="Calibri" w:eastAsia="Calibri" w:hAnsi="Calibri"/>
+          <w:i/>
+          <w:iCs/>
+        </w:rPr>
+        <w:t xml:space="preserve">BIO Web of Conferences</w:t>
+      </w:r>
+      <w:r>
+        <w:rPr>
+          <w:rFonts w:ascii="Calibri" w:cs="Calibri" w:eastAsia="Calibri" w:hAnsi="Calibri"/>
+        </w:rPr>
+        <w:t xml:space="preserve">, 68, 01013 (44th World Congress of Vine and Wine). https://doi.org/10.1051/bioconf/20236801013</w:t>
       </w:r>
     </w:p>
     <w:p>

</xml_diff>

<commit_message>
docs: cotejar adjuntos FIRA y ubicar registro de IA en bibliografía
</commit_message>
<xml_diff>
--- a/reports/entrega/02_Bibliografia_CebadaVision.docx
+++ b/reports/entrega/02_Bibliografia_CebadaVision.docx
@@ -5,7 +5,7 @@
     <w:p>
       <w:pPr>
         <w:pStyle w:val="Title"/>
-        <w:spacing w:before="280" w:after="120"/>
+        <w:spacing w:after="120" w:before="280"/>
       </w:pPr>
       <w:r>
         <w:rPr>
@@ -138,6 +138,130 @@
         <w:rPr>
           <w:rFonts w:ascii="Calibri" w:cs="Calibri" w:eastAsia="Calibri" w:hAnsi="Calibri"/>
         </w:rPr>
+        <w:t xml:space="preserve">FIRA (2026). </w:t>
+      </w:r>
+      <w:r>
+        <w:rPr>
+          <w:rFonts w:ascii="Calibri" w:cs="Calibri" w:eastAsia="Calibri" w:hAnsi="Calibri"/>
+          <w:i/>
+          <w:iCs/>
+        </w:rPr>
+        <w:t xml:space="preserve">Ecuaciones de los índices de vegetación, Reto AgroCebada 2026</w:t>
+      </w:r>
+      <w:r>
+        <w:rPr>
+          <w:rFonts w:ascii="Calibri" w:cs="Calibri" w:eastAsia="Calibri" w:hAnsi="Calibri"/>
+        </w:rPr>
+        <w:t xml:space="preserve">. Documento técnico proporcionado por el Comité Organizador, pp. 1–2.</w:t>
+      </w:r>
+    </w:p>
+    <w:p>
+      <w:pPr>
+        <w:pStyle w:val="ListParagraph"/>
+        <w:numPr>
+          <w:ilvl w:val="0"/>
+          <w:numId w:val="2"/>
+        </w:numPr>
+        <w:spacing w:after="80" w:line="276"/>
+        <w:jc w:val="both"/>
+      </w:pPr>
+      <w:r>
+        <w:rPr>
+          <w:rFonts w:ascii="Calibri" w:cs="Calibri" w:eastAsia="Calibri" w:hAnsi="Calibri"/>
+        </w:rPr>
+        <w:t xml:space="preserve">FIRA (2026). </w:t>
+      </w:r>
+      <w:r>
+        <w:rPr>
+          <w:rFonts w:ascii="Calibri" w:cs="Calibri" w:eastAsia="Calibri" w:hAnsi="Calibri"/>
+          <w:i/>
+          <w:iCs/>
+        </w:rPr>
+        <w:t xml:space="preserve">Lineamientos y Guía de Registro de Proyectos, Reto AgroCebada FIRA 2026</w:t>
+      </w:r>
+      <w:r>
+        <w:rPr>
+          <w:rFonts w:ascii="Calibri" w:cs="Calibri" w:eastAsia="Calibri" w:hAnsi="Calibri"/>
+        </w:rPr>
+        <w:t xml:space="preserve">. Guía proporcionada a los equipos, pp. 2–4.</w:t>
+      </w:r>
+    </w:p>
+    <w:p>
+      <w:pPr>
+        <w:pStyle w:val="ListParagraph"/>
+        <w:numPr>
+          <w:ilvl w:val="0"/>
+          <w:numId w:val="2"/>
+        </w:numPr>
+        <w:spacing w:after="80" w:line="276"/>
+        <w:jc w:val="both"/>
+      </w:pPr>
+      <w:r>
+        <w:rPr>
+          <w:rFonts w:ascii="Calibri" w:cs="Calibri" w:eastAsia="Calibri" w:hAnsi="Calibri"/>
+        </w:rPr>
+        <w:t xml:space="preserve">FIRA (2026). </w:t>
+      </w:r>
+      <w:r>
+        <w:rPr>
+          <w:rFonts w:ascii="Calibri" w:cs="Calibri" w:eastAsia="Calibri" w:hAnsi="Calibri"/>
+          <w:i/>
+          <w:iCs/>
+        </w:rPr>
+        <w:t xml:space="preserve">Preguntas y respuestas adicionales</w:t>
+      </w:r>
+      <w:r>
+        <w:rPr>
+          <w:rFonts w:ascii="Calibri" w:cs="Calibri" w:eastAsia="Calibri" w:hAnsi="Calibri"/>
+        </w:rPr>
+        <w:t xml:space="preserve">. Documento de apoyo para integrantes del jurado, pp. 1–3; preguntas 1–8.</w:t>
+      </w:r>
+    </w:p>
+    <w:p>
+      <w:pPr>
+        <w:pStyle w:val="ListParagraph"/>
+        <w:numPr>
+          <w:ilvl w:val="0"/>
+          <w:numId w:val="2"/>
+        </w:numPr>
+        <w:spacing w:after="80" w:line="276"/>
+        <w:jc w:val="both"/>
+      </w:pPr>
+      <w:r>
+        <w:rPr>
+          <w:rFonts w:ascii="Calibri" w:cs="Calibri" w:eastAsia="Calibri" w:hAnsi="Calibri"/>
+        </w:rPr>
+        <w:t xml:space="preserve">FIRA (2026, 9 de octubre). </w:t>
+      </w:r>
+      <w:r>
+        <w:rPr>
+          <w:rFonts w:ascii="Calibri" w:cs="Calibri" w:eastAsia="Calibri" w:hAnsi="Calibri"/>
+          <w:i/>
+          <w:iCs/>
+        </w:rPr>
+        <w:t xml:space="preserve">Segunda sesión de preguntas y respuestas</w:t>
+      </w:r>
+      <w:r>
+        <w:rPr>
+          <w:rFonts w:ascii="Calibri" w:cs="Calibri" w:eastAsia="Calibri" w:hAnsi="Calibri"/>
+        </w:rPr>
+        <w:t xml:space="preserve">. Documento de apoyo para integrantes del jurado, pp. 1–2.</w:t>
+      </w:r>
+    </w:p>
+    <w:p>
+      <w:pPr>
+        <w:pStyle w:val="ListParagraph"/>
+        <w:numPr>
+          <w:ilvl w:val="0"/>
+          <w:numId w:val="2"/>
+        </w:numPr>
+        <w:spacing w:after="80" w:line="276"/>
+        <w:jc w:val="both"/>
+      </w:pPr>
+      <w:r>
+        <w:rPr>
+          <w:rFonts w:ascii="Calibri" w:cs="Calibri" w:eastAsia="Calibri" w:hAnsi="Calibri"/>
+        </w:rPr>
         <w:t xml:space="preserve">Funk, C., Peterson, P., Landsfeld, M., et al. (2015). The climate hazards infrared precipitation with stations—a new environmental record for monitoring extremes. </w:t>
       </w:r>
       <w:r>
@@ -401,6 +525,47 @@
           <w:rFonts w:ascii="Calibri" w:cs="Calibri" w:eastAsia="Calibri" w:hAnsi="Calibri"/>
         </w:rPr>
         <w:t xml:space="preserve">, 177, 105709.</w:t>
+      </w:r>
+    </w:p>
+    <w:p>
+      <w:pPr>
+        <w:pStyle w:val="Heading1"/>
+        <w:spacing w:after="120" w:before="280"/>
+      </w:pPr>
+      <w:r>
+        <w:rPr>
+          <w:rFonts w:ascii="Calibri" w:cs="Calibri" w:eastAsia="Calibri" w:hAnsi="Calibri"/>
+          <w:b/>
+          <w:bCs/>
+          <w:color w:val="2F4F1F"/>
+          <w:sz w:val="28"/>
+          <w:szCs w:val="28"/>
+        </w:rPr>
+        <w:t xml:space="preserve">Uso de inteligencia artificial generativa — pendiente de completar</w:t>
+      </w:r>
+    </w:p>
+    <w:p>
+      <w:pPr>
+        <w:spacing w:after="140" w:line="288"/>
+        <w:jc w:val="both"/>
+      </w:pPr>
+      <w:r>
+        <w:rPr>
+          <w:rFonts w:ascii="Calibri" w:cs="Calibri" w:eastAsia="Calibri" w:hAnsi="Calibri"/>
+        </w:rPr>
+        <w:t xml:space="preserve">La guía de registro de FIRA (p. 4, apartado Bibliografía) solicita los prompts utilizados, el propósito de cada uno y la herramienta empleada. Esta relación no sustituye las referencias bibliográficas, técnicas o de datos.</w:t>
+      </w:r>
+    </w:p>
+    <w:p>
+      <w:pPr>
+        <w:spacing w:after="140" w:line="288"/>
+        <w:jc w:val="both"/>
+      </w:pPr>
+      <w:r>
+        <w:rPr>
+          <w:rFonts w:ascii="Calibri" w:cs="Calibri" w:eastAsia="Calibri" w:hAnsi="Calibri"/>
+        </w:rPr>
+        <w:t xml:space="preserve">Falta incorporar los registros reales de cada integrante, con el texto de cada prompt, su propósito y la herramienta utilizada; indicar también el integrante y la actividad o archivo correspondiente para facilitar su revisión. No se han reconstruido ni inventado registros. Este apartado debe completarse y aprobarse antes de entregar el PDF de Bibliografía.</w:t>
       </w:r>
     </w:p>
     <w:sectPr>
@@ -415,6 +580,43 @@
 
 <file path=word/comments.xml><?xml version="1.0" encoding="utf-8"?>
 <w:comments xmlns:cx="http://schemas.microsoft.com/office/drawing/2014/chartex" xmlns:cx1="http://schemas.microsoft.com/office/drawing/2015/9/8/chartex" xmlns:cx2="http://schemas.microsoft.com/office/drawing/2015/10/21/chartex" xmlns:cx3="http://schemas.microsoft.com/office/drawing/2016/5/9/chartex" xmlns:cx4="http://schemas.microsoft.com/office/drawing/2016/5/10/chartex" xmlns:cx5="http://schemas.microsoft.com/office/drawing/2016/5/11/chartex" xmlns:cx6="http://schemas.microsoft.com/office/drawing/2016/5/12/chartex" xmlns:cx7="http://schemas.microsoft.com/office/drawing/2016/5/13/chartex" xmlns:cx8="http://schemas.microsoft.com/office/drawing/2016/5/14/chartex" xmlns:mc="http://schemas.openxmlformats.org/markup-compatibility/2006" xmlns:aink="http://schemas.microsoft.com/office/drawing/2016/ink" xmlns:am3d="http://schemas.microsoft.com/office/drawing/2017/model3d" xmlns:o="urn:schemas-microsoft-com:office:office" xmlns:r="http://schemas.openxmlformats.org/officeDocument/2006/relationships" xmlns:m="http://schemas.openxmlformats.org/officeDocument/2006/math" xmlns:v="urn:schemas-microsoft-com:vml" xmlns:wp14="http://schemas.microsoft.com/office/word/2010/wordprocessingDrawing" xmlns:wp="http://schemas.openxmlformats.org/drawingml/2006/wordprocessingDrawing" xmlns:w10="urn:schemas-microsoft-com:office:word" xmlns:w="http://schemas.openxmlformats.org/wordprocessingml/2006/main" xmlns:w14="http://schemas.microsoft.com/office/word/2010/wordml" xmlns:w15="http://schemas.microsoft.com/office/word/2012/wordml" xmlns:w16cex="http://schemas.microsoft.com/office/word/2018/wordml/cex" xmlns:w16cid="http://schemas.microsoft.com/office/word/2016/wordml/cid" xmlns:w16="http://schemas.microsoft.com/office/word/2018/wordml" xmlns:w16sdtdh="http://schemas.microsoft.com/office/word/2020/wordml/sdtdatahash" xmlns:w16se="http://schemas.microsoft.com/office/word/2015/wordml/symex" xmlns:wpg="http://schemas.microsoft.com/office/word/2010/wordprocessingGroup" xmlns:wpi="http://schemas.microsoft.com/office/word/2010/wordprocessingInk" xmlns:wne="http://schemas.microsoft.com/office/word/2006/wordml" xmlns:wps="http://schemas.microsoft.com/office/word/2010/wordprocessingShape"/>
+</file>
+
+<file path=word/endnotes.xml><?xml version="1.0" encoding="utf-8"?>
+<w:endnotes xmlns:wpc="http://schemas.microsoft.com/office/word/2010/wordprocessingCanvas" xmlns:mc="http://schemas.openxmlformats.org/markup-compatibility/2006" xmlns:o="urn:schemas-microsoft-com:office:office" xmlns:r="http://schemas.openxmlformats.org/officeDocument/2006/relationships" xmlns:m="http://schemas.openxmlformats.org/officeDocument/2006/math" xmlns:v="urn:schemas-microsoft-com:vml" xmlns:wp14="http://schemas.microsoft.com/office/word/2010/wordprocessingDrawing" xmlns:wp="http://schemas.openxmlformats.org/drawingml/2006/wordprocessingDrawing" xmlns:w10="urn:schemas-microsoft-com:office:word" xmlns:w="http://schemas.openxmlformats.org/wordprocessingml/2006/main" xmlns:w14="http://schemas.microsoft.com/office/word/2010/wordml" xmlns:w15="http://schemas.microsoft.com/office/word/2012/wordml" xmlns:wpg="http://schemas.microsoft.com/office/word/2010/wordprocessingGroup" xmlns:wpi="http://schemas.microsoft.com/office/word/2010/wordprocessingInk" xmlns:wne="http://schemas.microsoft.com/office/word/2006/wordml" xmlns:wps="http://schemas.microsoft.com/office/word/2010/wordprocessingShape" mc:Ignorable="w14 w15 wp14">
+  <w:endnote w:type="separator" w:id="-1">
+    <w:p>
+      <w:pPr>
+        <w:spacing w:after="0" w:line="240" w:lineRule="auto"/>
+      </w:pPr>
+      <w:r>
+        <w:rPr>
+          <w:rStyle w:val="EndnoteReference"/>
+        </w:rPr>
+        <w:endnoteRef/>
+      </w:r>
+      <w:r>
+        <w:separator/>
+      </w:r>
+    </w:p>
+  </w:endnote>
+  <w:endnote w:type="continuationSeparator" w:id="0">
+    <w:p>
+      <w:pPr>
+        <w:spacing w:after="0" w:line="240" w:lineRule="auto"/>
+      </w:pPr>
+      <w:r>
+        <w:rPr>
+          <w:rStyle w:val="EndnoteReference"/>
+        </w:rPr>
+        <w:endnoteRef/>
+      </w:r>
+      <w:r>
+        <w:continuationSeparator/>
+      </w:r>
+    </w:p>
+  </w:endnote>
+</w:endnotes>
 </file>
 
 <file path=word/footnotes.xml><?xml version="1.0" encoding="utf-8"?>
@@ -725,5 +927,42 @@
       <w:szCs w:val="20"/>
     </w:rPr>
   </w:style>
+  <w:style w:type="character" w:styleId="EndnoteReference">
+    <w:name w:val="endnote reference"/>
+    <w:basedOn w:val="DefaultParagraphFont"/>
+    <w:uiPriority w:val="99"/>
+    <w:semiHidden/>
+    <w:unhideWhenUsed/>
+    <w:rPr>
+      <w:vertAlign w:val="superscript"/>
+    </w:rPr>
+  </w:style>
+  <w:style w:type="paragraph" w:styleId="EndnoteText">
+    <w:name w:val="endnote text"/>
+    <w:basedOn w:val="Normal"/>
+    <w:link w:val="EndnoteTextChar"/>
+    <w:uiPriority w:val="99"/>
+    <w:semiHidden/>
+    <w:unhideWhenUsed/>
+    <w:pPr>
+      <w:spacing w:after="0" w:line="240" w:lineRule="auto"/>
+    </w:pPr>
+    <w:rPr>
+      <w:sz w:val="20"/>
+      <w:szCs w:val="20"/>
+    </w:rPr>
+  </w:style>
+  <w:style w:type="character" w:styleId="EndnoteTextChar">
+    <w:name w:val="Endnote Text Char"/>
+    <w:basedOn w:val="DefaultParagraphFont"/>
+    <w:link w:val="EndnoteText"/>
+    <w:uiPriority w:val="99"/>
+    <w:semiHidden/>
+    <w:unhideWhenUsed/>
+    <w:rPr>
+      <w:sz w:val="20"/>
+      <w:szCs w:val="20"/>
+    </w:rPr>
+  </w:style>
 </w:styles>
 </file>
</xml_diff>